<commit_message>
main prog task is done
</commit_message>
<xml_diff>
--- a/opd/Отчет 3 ОПД.docx
+++ b/opd/Отчет 3 ОПД.docx
@@ -3727,7 +3727,19 @@
     </w:p>
     <w:p>
       <w:r>
-        <w:t xml:space="preserve">Находит количество нечетных чисел. </w:t>
+        <w:t xml:space="preserve">Находит </w:t>
+      </w:r>
+      <w:r>
+        <w:t>число</w:t>
+      </w:r>
+      <w:r>
+        <w:t xml:space="preserve"> нечетных </w:t>
+      </w:r>
+      <w:r>
+        <w:t>элементов</w:t>
+      </w:r>
+      <w:r>
+        <w:t xml:space="preserve">. </w:t>
       </w:r>
     </w:p>
     <w:p>
@@ -3903,13 +3915,7 @@
         <w:rPr>
           <w:rFonts w:eastAsiaTheme="minorEastAsia"/>
         </w:rPr>
-        <w:t xml:space="preserve">216 — </w:t>
-      </w:r>
-      <w:r>
-        <w:rPr>
-          <w:rFonts w:eastAsiaTheme="minorEastAsia"/>
-        </w:rPr>
-        <w:t>знаковое 16-разрядное число</w:t>
+        <w:t>216 — знаковое 16-разрядное число</w:t>
       </w:r>
     </w:p>
     <w:p>
@@ -3997,49 +4003,30 @@
         <w:rPr>
           <w:lang w:val="en-US"/>
         </w:rPr>
-        <w:t>M(</w:t>
+        <w:t>M</w:t>
+      </w:r>
+      <w:r>
+        <w:t>(</w:t>
       </w:r>
       <w:proofErr w:type="gramEnd"/>
       <w:r>
-        <w:rPr>
-          <w:lang w:val="en-US"/>
-        </w:rPr>
         <w:t>21</w:t>
       </w:r>
       <w:r>
         <w:t>4</w:t>
       </w:r>
       <w:r>
-        <w:rPr>
-          <w:lang w:val="en-US"/>
-        </w:rPr>
-        <w:t>,215</w:t>
+        <w:t>,215)-</w:t>
       </w:r>
       <w:r>
-        <w:rPr>
-          <w:lang w:val="en-US"/>
-        </w:rPr>
-        <w:t>)-</w:t>
-      </w:r>
-      <w:r>
-        <w:t>адреса элементов массива</w:t>
-      </w:r>
-      <w:r>
-        <w:t xml:space="preserve"> </w:t>
+        <w:t xml:space="preserve">адреса элементов массива </w:t>
       </w:r>
       <m:oMath>
         <m:r>
           <w:rPr>
             <w:rFonts w:ascii="Cambria Math" w:hAnsi="Cambria Math"/>
           </w:rPr>
-          <m:t>∈</m:t>
-        </m:r>
-        <m:r>
-          <w:rPr>
-            <w:rFonts w:ascii="Cambria Math" w:hAnsi="Cambria Math"/>
-            <w:lang w:val="en-US"/>
-          </w:rPr>
-          <m:t>[1;</m:t>
+          <m:t>∈[1;</m:t>
         </m:r>
         <m:sSup>
           <m:sSupPr>
@@ -4055,7 +4042,6 @@
             <m:r>
               <w:rPr>
                 <w:rFonts w:ascii="Cambria Math" w:hAnsi="Cambria Math"/>
-                <w:lang w:val="en-US"/>
               </w:rPr>
               <m:t>2</m:t>
             </m:r>
@@ -4064,22 +4050,14 @@
             <m:r>
               <w:rPr>
                 <w:rFonts w:ascii="Cambria Math" w:hAnsi="Cambria Math"/>
-                <w:lang w:val="en-US"/>
-              </w:rPr>
-              <m:t>1</m:t>
-            </m:r>
-            <m:r>
-              <w:rPr>
-                <w:rFonts w:ascii="Cambria Math" w:hAnsi="Cambria Math"/>
-              </w:rPr>
-              <m:t>1</m:t>
+              </w:rPr>
+              <m:t>11</m:t>
             </m:r>
           </m:sup>
         </m:sSup>
         <m:r>
           <w:rPr>
             <w:rFonts w:ascii="Cambria Math" w:hAnsi="Cambria Math"/>
-            <w:lang w:val="en-US"/>
           </w:rPr>
           <m:t>-1]</m:t>
         </m:r>
@@ -4089,7 +4067,6 @@
       <w:pPr>
         <w:rPr>
           <w:rFonts w:eastAsiaTheme="minorEastAsia"/>
-          <w:lang w:val="en-US"/>
         </w:rPr>
       </w:pPr>
       <w:proofErr w:type="gramStart"/>
@@ -4097,13 +4074,13 @@
         <w:rPr>
           <w:lang w:val="en-US"/>
         </w:rPr>
-        <w:t>M(</w:t>
+        <w:t>M</w:t>
+      </w:r>
+      <w:r>
+        <w:t>(</w:t>
       </w:r>
       <w:proofErr w:type="gramEnd"/>
       <w:r>
-        <w:rPr>
-          <w:lang w:val="en-US"/>
-        </w:rPr>
         <w:t>216)-</w:t>
       </w:r>
       <w:r>
@@ -4114,14 +4091,7 @@
           <w:rPr>
             <w:rFonts w:ascii="Cambria Math" w:hAnsi="Cambria Math"/>
           </w:rPr>
-          <m:t>∈</m:t>
-        </m:r>
-        <m:r>
-          <w:rPr>
-            <w:rFonts w:ascii="Cambria Math" w:hAnsi="Cambria Math"/>
-            <w:lang w:val="en-US"/>
-          </w:rPr>
-          <m:t>[1;</m:t>
+          <m:t>∈[1;</m:t>
         </m:r>
         <m:sSup>
           <m:sSupPr>
@@ -4137,7 +4107,6 @@
             <m:r>
               <w:rPr>
                 <w:rFonts w:ascii="Cambria Math" w:hAnsi="Cambria Math"/>
-                <w:lang w:val="en-US"/>
               </w:rPr>
               <m:t>2</m:t>
             </m:r>
@@ -4146,7 +4115,6 @@
             <m:r>
               <w:rPr>
                 <w:rFonts w:ascii="Cambria Math" w:hAnsi="Cambria Math"/>
-                <w:lang w:val="en-US"/>
               </w:rPr>
               <m:t>7</m:t>
             </m:r>
@@ -4155,7 +4123,6 @@
         <m:r>
           <w:rPr>
             <w:rFonts w:ascii="Cambria Math" w:hAnsi="Cambria Math"/>
-            <w:lang w:val="en-US"/>
           </w:rPr>
           <m:t>-1]</m:t>
         </m:r>
@@ -4180,25 +4147,10 @@
         <w:rPr>
           <w:lang w:val="en-US"/>
         </w:rPr>
-        <w:t>21</w:t>
+        <w:t>217)-</w:t>
       </w:r>
       <w:r>
-        <w:rPr>
-          <w:lang w:val="en-US"/>
-        </w:rPr>
-        <w:t>7</w:t>
-      </w:r>
-      <w:r>
-        <w:rPr>
-          <w:lang w:val="en-US"/>
-        </w:rPr>
-        <w:t>)-</w:t>
-      </w:r>
-      <w:r>
-        <w:t>результат</w:t>
-      </w:r>
-      <w:r>
-        <w:t xml:space="preserve"> </w:t>
+        <w:t xml:space="preserve">результат </w:t>
       </w:r>
       <m:oMath>
         <m:r>
@@ -17724,6 +17676,7 @@
   <w:style w:type="character" w:default="1" w:styleId="a0">
     <w:name w:val="Default Paragraph Font"/>
     <w:uiPriority w:val="1"/>
+    <w:semiHidden/>
     <w:unhideWhenUsed/>
   </w:style>
   <w:style w:type="table" w:default="1" w:styleId="a1">

</xml_diff>